<commit_message>
Kim11_tema-1-dijital-unite-sonu-sorulari: gorsel alanlarina Shutter onizlemeleri yerlestirildi (2.3 bicimi)
</commit_message>
<xml_diff>
--- a/dijital/Kim11_tema-1-dijital-unite-sonu-sorulari.docx
+++ b/dijital/Kim11_tema-1-dijital-unite-sonu-sorulari.docx
@@ -202,85 +202,59 @@
         <w:t xml:space="preserve">) suda çözündüğünde paket ısınır.</w:t>
       </w:r>
     </w:p>
-    <w:tbl>
-      <w:tblPr>
-        <w:tblW w:w="9000" w:type="dxa"/>
+    <w:p>
+      <w:pPr>
         <w:jc w:val="center"/>
-        <w:tblBorders>
-          <w:top w:val="single" w:sz="8" w:space="0" w:color="7F7F7F"/>
-          <w:left w:val="single" w:sz="8" w:space="0" w:color="7F7F7F"/>
-          <w:bottom w:val="single" w:sz="8" w:space="0" w:color="7F7F7F"/>
-          <w:right w:val="single" w:sz="8" w:space="0" w:color="7F7F7F"/>
-        </w:tblBorders>
-      </w:tblPr>
-      <w:tblGrid>
-        <w:gridCol w:w="9000"/>
-      </w:tblGrid>
-      <w:tr>
-        <w:tc>
-          <w:tcPr>
-            <w:tcW w:w="9000" w:type="dxa"/>
-            <w:shd w:val="clear" w:color="auto" w:fill="EDEDED"/>
-          </w:tcPr>
-          <w:p>
-            <w:pPr>
-              <w:jc w:val="both"/>
-              <w:rPr>
-                <w:rFonts w:ascii="Times New Roman" w:hAnsi="Times New Roman" w:cs="Times New Roman"/>
-                <w:lang w:val="tr-TR"/>
-              </w:rPr>
-            </w:pPr>
-            <w:r>
-              <w:rPr>
-                <w:rFonts w:ascii="Times New Roman" w:hAnsi="Times New Roman" w:cs="Times New Roman"/>
-                <w:lang w:val="tr-TR"/>
-              </w:rPr>
-              <w:t xml:space="preserve">GÖRSEL ALANI (Shutterstock)</w:t>
-            </w:r>
-          </w:p>
-          <w:p>
-            <w:pPr>
-              <w:jc w:val="both"/>
-              <w:rPr>
-                <w:rFonts w:ascii="Times New Roman" w:hAnsi="Times New Roman" w:cs="Times New Roman"/>
-                <w:lang w:val="tr-TR"/>
-              </w:rPr>
-            </w:pPr>
-            <w:r>
-              <w:rPr>
-                <w:rFonts w:ascii="Times New Roman" w:hAnsi="Times New Roman" w:cs="Times New Roman"/>
-                <w:lang w:val="tr-TR"/>
-              </w:rPr>
-              <w:t xml:space="preserve">Tarif: Bileğe ya da dizine uygulanan beyaz/mavi anlık soğuk paket (instant cold pack).</w:t>
-            </w:r>
-          </w:p>
-          <w:p>
-            <w:pPr>
-              <w:jc w:val="both"/>
-              <w:rPr>
-                <w:rFonts w:ascii="Times New Roman" w:hAnsi="Times New Roman" w:cs="Times New Roman"/>
-                <w:lang w:val="tr-TR"/>
-              </w:rPr>
-            </w:pPr>
-            <w:r>
-              <w:rPr>
-                <w:rFonts w:ascii="Times New Roman" w:hAnsi="Times New Roman" w:cs="Times New Roman"/>
-                <w:lang w:val="tr-TR"/>
-              </w:rPr>
-              <w:t xml:space="preserve">Shutter ID: 2364117633 (fotoğraf) — Woman applies Cold Instant Pack to her left knee</w:t>
-            </w:r>
-          </w:p>
-        </w:tc>
-      </w:tr>
-    </w:tbl>
+      </w:pPr>
+      <w:r>
+        <w:drawing>
+          <wp:inline xmlns:a="http://schemas.openxmlformats.org/drawingml/2006/main" xmlns:pic="http://schemas.openxmlformats.org/drawingml/2006/picture">
+            <wp:extent cx="3436363" cy="2520000"/>
+            <wp:docPr id="1" name="Picture 1"/>
+            <wp:cNvGraphicFramePr>
+              <a:graphicFrameLocks noChangeAspect="1"/>
+            </wp:cNvGraphicFramePr>
+            <a:graphic>
+              <a:graphicData uri="http://schemas.openxmlformats.org/drawingml/2006/picture">
+                <pic:pic>
+                  <pic:nvPicPr>
+                    <pic:cNvPr id="0" name="2364117633_d.jpg"/>
+                    <pic:cNvPicPr/>
+                  </pic:nvPicPr>
+                  <pic:blipFill>
+                    <a:blip r:embed="rId11"/>
+                    <a:stretch>
+                      <a:fillRect/>
+                    </a:stretch>
+                  </pic:blipFill>
+                  <pic:spPr>
+                    <a:xfrm>
+                      <a:off x="0" y="0"/>
+                      <a:ext cx="3436363" cy="2520000"/>
+                    </a:xfrm>
+                    <a:prstGeom prst="rect"/>
+                  </pic:spPr>
+                </pic:pic>
+              </a:graphicData>
+            </a:graphic>
+          </wp:inline>
+        </w:drawing>
+      </w:r>
+    </w:p>
     <w:p>
       <w:pPr>
-        <w:jc w:val="both"/>
-        <w:rPr>
-          <w:rFonts w:ascii="Times New Roman" w:hAnsi="Times New Roman" w:cs="Times New Roman"/>
-          <w:lang w:val="tr-TR"/>
-        </w:rPr>
-      </w:pPr>
+        <w:jc w:val="center"/>
+      </w:pPr>
+      <w:r>
+        <w:rPr>
+          <w:rFonts w:ascii="Times New Roman" w:hAnsi="Times New Roman" w:cs="Times New Roman"/>
+          <w:b/>
+          <w:bCs/>
+          <w:highlight w:val="yellow"/>
+          <w:lang w:val="tr-TR"/>
+        </w:rPr>
+        <w:t xml:space="preserve">Shutter id: 2364117633</w:t>
+      </w:r>
     </w:p>
     <w:p>
       <w:pPr>

</xml_diff>